<commit_message>
Shorten video speech to about 600 words
Co-Authored-By: Claude Opus 5.5 <noreply@anthropic.com>
Claude-Session: https://claude.ai/code/session_01B5ATUDZVupjMwC75REBTzv
</commit_message>
<xml_diff>
--- a/speech/CallMindVoice_PM_Video_Speech.docx
+++ b/speech/CallMindVoice_PM_Video_Speech.docx
@@ -2,7 +2,7 @@
 <file path=word/document.xml><?xml version="1.0" encoding="utf-8"?>
 <w:document xmlns:w="http://schemas.openxmlformats.org/wordprocessingml/2006/main" xmlns:m="http://schemas.openxmlformats.org/officeDocument/2006/math" xmlns:r="http://schemas.openxmlformats.org/officeDocument/2006/relationships" xmlns:o="urn:schemas-microsoft-com:office:office" xmlns:v="urn:schemas-microsoft-com:vml" xmlns:w10="urn:schemas-microsoft-com:office:word" xmlns:a="http://schemas.openxmlformats.org/drawingml/2006/main" xmlns:pic="http://schemas.openxmlformats.org/drawingml/2006/picture" xmlns:wp="http://schemas.openxmlformats.org/drawingml/2006/wordprocessingDrawing">
   <w:body>
-    <w:bookmarkStart w:id="29" w:name="callmindvoice-pm-video-speech"/>
+    <w:bookmarkStart w:id="28" w:name="callmindvoice-pm-video-speech"/>
     <w:p>
       <w:pPr>
         <w:pStyle w:val="Heading1"/>
@@ -16,7 +16,7 @@
         <w:pStyle w:val="FirstParagraph"/>
       </w:pPr>
       <w:r>
-        <w:t xml:space="preserve">Muhammadjon · October 15, 2026</w:t>
+        <w:t xml:space="preserve">Muhammadjon · October 16, 2026</w:t>
       </w:r>
     </w:p>
     <w:p>
@@ -28,7 +28,7 @@
           <w:iCs/>
           <w:i/>
         </w:rPr>
-        <w:t xml:space="preserve">The full speech is about 1,000 words, which takes about 7 minutes at a normal speaking pace. Parts 7 and 8 cover the required project status and plan. Each part shows its rough start time. All money figures are estimates at market rates.</w:t>
+        <w:t xml:space="preserve">About 600 words: 5–6 minutes at a calm pace. Parts 6 and 7 cover the required project status and plan. All money figures are estimates.</w:t>
       </w:r>
     </w:p>
     <w:bookmarkStart w:id="20" w:name="opening-000"/>
@@ -45,7 +45,76 @@
         <w:pStyle w:val="FirstParagraph"/>
       </w:pPr>
       <w:r>
-        <w:t xml:space="preserve">Hello everyone. My name is Muhammadjon. I am a master’s student at IT Park University.</w:t>
+        <w:t xml:space="preserve">Hello everyone. My name is Muhammadjon, and I am a master’s student at IT Park University. My research topic is</w:t>
+      </w:r>
+      <w:r>
+        <w:t xml:space="preserve"> </w:t>
+      </w:r>
+      <w:r>
+        <w:t xml:space="preserve">“</w:t>
+      </w:r>
+      <w:r>
+        <w:t xml:space="preserve">Comparative Research on the Effectiveness of AI-Driven Intelligent Agent Systems and Traditional Approaches in Financial Management of IT Projects</w:t>
+      </w:r>
+      <w:r>
+        <w:t xml:space="preserve">”</w:t>
+      </w:r>
+      <w:r>
+        <w:t xml:space="preserve">. Today I will show it with a real project, CallMindVoice, where I was the project manager.</w:t>
+      </w:r>
+    </w:p>
+    <w:bookmarkEnd w:id="20"/>
+    <w:bookmarkStart w:id="21" w:name="the-project-035"/>
+    <w:p>
+      <w:pPr>
+        <w:pStyle w:val="Heading2"/>
+      </w:pPr>
+      <w:r>
+        <w:t xml:space="preserve">2. The project (0:35)</w:t>
+      </w:r>
+    </w:p>
+    <w:p>
+      <w:pPr>
+        <w:pStyle w:val="FirstParagraph"/>
+      </w:pPr>
+      <w:r>
+        <w:t xml:space="preserve">CallMindVoice is an AI voice agent. It answers customer phone calls in Uzbek, Russian and English. A company uploads its own documents, like price lists. When a customer calls, the system finds the answer in these documents and speaks it. If it is not sure, it passes the call to a human operator. So it never invents a price.</w:t>
+      </w:r>
+    </w:p>
+    <w:bookmarkEnd w:id="21"/>
+    <w:bookmarkStart w:id="22" w:name="team-and-tasks-110"/>
+    <w:p>
+      <w:pPr>
+        <w:pStyle w:val="Heading2"/>
+      </w:pPr>
+      <w:r>
+        <w:t xml:space="preserve">3. Team and tasks (1:10)</w:t>
+      </w:r>
+    </w:p>
+    <w:p>
+      <w:pPr>
+        <w:pStyle w:val="FirstParagraph"/>
+      </w:pPr>
+      <w:r>
+        <w:t xml:space="preserve">Our team had seven people: two AI engineers, two backend engineers, one frontend engineer, one QA engineer, and me. All tasks lived in our own task manager, which works like Jira. Every task had an owner, a reviewer and an estimate. It moved from To Do to In Progress, Code Review, Testing and Done. We worked in short sprints from September 7 to October 16.</w:t>
+      </w:r>
+    </w:p>
+    <w:bookmarkEnd w:id="22"/>
+    <w:bookmarkStart w:id="23" w:name="how-i-managed-the-finances-150"/>
+    <w:p>
+      <w:pPr>
+        <w:pStyle w:val="Heading2"/>
+      </w:pPr>
+      <w:r>
+        <w:t xml:space="preserve">4. How I managed the finances (1:50)</w:t>
+      </w:r>
+    </w:p>
+    <w:p>
+      <w:pPr>
+        <w:pStyle w:val="FirstParagraph"/>
+      </w:pPr>
+      <w:r>
+        <w:t xml:space="preserve">Now the main part: money. I split the budget into four groups: team hours, servers, AI services and telephony. I turned task estimates into hours, and hours into money.</w:t>
       </w:r>
     </w:p>
     <w:p>
@@ -53,22 +122,7 @@
         <w:pStyle w:val="BodyText"/>
       </w:pPr>
       <w:r>
-        <w:t xml:space="preserve">My research topic is</w:t>
-      </w:r>
-      <w:r>
-        <w:t xml:space="preserve"> </w:t>
-      </w:r>
-      <w:r>
-        <w:t xml:space="preserve">“</w:t>
-      </w:r>
-      <w:r>
-        <w:t xml:space="preserve">Comparative Research on the Effectiveness of AI-Driven Intelligent Agent Systems and Traditional Approaches in Financial Management of IT Projects</w:t>
-      </w:r>
-      <w:r>
-        <w:t xml:space="preserve">”</w:t>
-      </w:r>
-      <w:r>
-        <w:t xml:space="preserve">. In simple words, I study how money is planned and controlled in IT projects, and I compare the classic way with the way where AI agents help.</w:t>
+        <w:t xml:space="preserve">Our estimated budget was about 74 million som, and the estimated real cost was about 76 million som. So we were only about 2.5 percent over budget. The team needed more hours than planned, but we saved on AI services and telephony. Why? The system has a free local AI engine, and paid AI is used only when needed. We also tested calls with a simulator, not with paid phone minutes.</w:t>
       </w:r>
     </w:p>
     <w:p>
@@ -76,158 +130,22 @@
         <w:pStyle w:val="BodyText"/>
       </w:pPr>
       <w:r>
-        <w:t xml:space="preserve">Today I will show this with a real project. I was the project manager of CallMindVoice. I will explain how we built it, how I gave tasks to the developers, and how I managed the project’s budget and costs.</w:t>
-      </w:r>
-    </w:p>
-    <w:bookmarkEnd w:id="20"/>
-    <w:bookmarkStart w:id="21" w:name="the-project-040"/>
+        <w:t xml:space="preserve">The product saves money for customers too. For example, if a clinic pays 2.5 million som a month and saves one operator’s salary of 6 million, it gets 3.5 million som extra every month.</w:t>
+      </w:r>
+    </w:p>
+    <w:bookmarkEnd w:id="23"/>
+    <w:bookmarkStart w:id="24" w:name="traditional-vs-ai-driven-320"/>
     <w:p>
       <w:pPr>
         <w:pStyle w:val="Heading2"/>
       </w:pPr>
       <w:r>
-        <w:t xml:space="preserve">2. The project (0:40)</w:t>
+        <w:t xml:space="preserve">5. Traditional vs AI-driven (3:20)</w:t>
       </w:r>
     </w:p>
     <w:p>
       <w:pPr>
         <w:pStyle w:val="FirstParagraph"/>
-      </w:pPr>
-      <w:r>
-        <w:t xml:space="preserve">First, what is CallMindVoice? It is an AI voice agent. It answers customer phone calls for companies. It speaks Uzbek, Russian and English.</w:t>
-      </w:r>
-    </w:p>
-    <w:p>
-      <w:pPr>
-        <w:pStyle w:val="BodyText"/>
-      </w:pPr>
-      <w:r>
-        <w:t xml:space="preserve">Here is how it works. A company uploads its own documents, like price lists and FAQs. When a customer calls, the system turns speech into text. Then it searches the company’s documents for the answer. If it is sure about the answer, it speaks the answer back. If it is not sure, it passes the call to a human operator.</w:t>
-      </w:r>
-    </w:p>
-    <w:p>
-      <w:pPr>
-        <w:pStyle w:val="BodyText"/>
-      </w:pPr>
-      <w:r>
-        <w:t xml:space="preserve">This was very important for us. The agent must never invent a price or a fact. So every answer comes only from the documents, and the system knows when to stop.</w:t>
-      </w:r>
-    </w:p>
-    <w:bookmarkEnd w:id="21"/>
-    <w:bookmarkStart w:id="22" w:name="the-team-130"/>
-    <w:p>
-      <w:pPr>
-        <w:pStyle w:val="Heading2"/>
-      </w:pPr>
-      <w:r>
-        <w:t xml:space="preserve">3. The team (1:30)</w:t>
-      </w:r>
-    </w:p>
-    <w:p>
-      <w:pPr>
-        <w:pStyle w:val="FirstParagraph"/>
-      </w:pPr>
-      <w:r>
-        <w:t xml:space="preserve">Our team had seven people: two AI engineers, two backend engineers, one frontend engineer, one QA and DevOps engineer, and me as the project manager. Every part of the system had one clear owner, so I always knew who should do a new task. People are also the biggest cost in any IT project, so the team plan was my first financial plan.</w:t>
-      </w:r>
-    </w:p>
-    <w:bookmarkEnd w:id="22"/>
-    <w:bookmarkStart w:id="23" w:name="how-i-managed-the-project-finances-200"/>
-    <w:p>
-      <w:pPr>
-        <w:pStyle w:val="Heading2"/>
-      </w:pPr>
-      <w:r>
-        <w:t xml:space="preserve">4. How I managed the project finances (2:00)</w:t>
-      </w:r>
-    </w:p>
-    <w:p>
-      <w:pPr>
-        <w:pStyle w:val="FirstParagraph"/>
-      </w:pPr>
-      <w:r>
-        <w:t xml:space="preserve">Now the main part: money. I split our budget into four groups. First, the team’s working hours. Second, servers. Third, AI services, like the language model, speech-to-text and text-to-speech. And fourth, telephony, which is the cost of phone calls.</w:t>
-      </w:r>
-    </w:p>
-    <w:p>
-      <w:pPr>
-        <w:pStyle w:val="BodyText"/>
-      </w:pPr>
-      <w:r>
-        <w:t xml:space="preserve">To plan the team cost, I used our tasks. Every task had an estimate. I turned the estimates into hours, and the hours into money. So the cost of a sprint was simply the cost of its tasks. Our estimated budget was about 74 million som, and the estimated real cost was about 76 million som. So we were only about 2.5 percent over budget. The team cost was a little higher than planned, but we saved money on AI services and telephony, thanks to the free engine and the call simulator.</w:t>
-      </w:r>
-    </w:p>
-    <w:p>
-      <w:pPr>
-        <w:pStyle w:val="BodyText"/>
-      </w:pPr>
-      <w:r>
-        <w:t xml:space="preserve">We also made smart technical decisions that saved money. The system has a free local AI engine. Paid AI services work only when we add a key, and if they fail, the system goes back to the free engine. So we could test and give demos almost for free. We also saved fixed phrases, like greetings, as ready audio files, so we do not pay to create them again for every call.</w:t>
-      </w:r>
-    </w:p>
-    <w:p>
-      <w:pPr>
-        <w:pStyle w:val="BodyText"/>
-      </w:pPr>
-      <w:r>
-        <w:t xml:space="preserve">The product also saves money for our customers. The agent answers simple calls by itself, and only difficult calls go to a human operator. So a company needs fewer operators for the same number of calls. For example, if a clinic pays 2.5 million som a month for our system and saves one operator’s salary of 6 million som, it earns back its money and gets 3.5 million som extra every month.</w:t>
-      </w:r>
-    </w:p>
-    <w:bookmarkEnd w:id="23"/>
-    <w:bookmarkStart w:id="24" w:name="where-and-how-we-gave-tasks-310"/>
-    <w:p>
-      <w:pPr>
-        <w:pStyle w:val="Heading2"/>
-      </w:pPr>
-      <w:r>
-        <w:t xml:space="preserve">5. Where and how we gave tasks (3:10)</w:t>
-      </w:r>
-    </w:p>
-    <w:p>
-      <w:pPr>
-        <w:pStyle w:val="FirstParagraph"/>
-      </w:pPr>
-      <w:r>
-        <w:t xml:space="preserve">All tasks lived in one place: our own task manager. We built it ourselves, and it works like Jira. My rule was simple: if a task is not in the task manager, it does not exist.</w:t>
-      </w:r>
-    </w:p>
-    <w:p>
-      <w:pPr>
-        <w:pStyle w:val="BodyText"/>
-      </w:pPr>
-      <w:r>
-        <w:t xml:space="preserve">Every task moves through the same steps: Backlog, To Do, In Progress, Code Review, Testing and Done. If the reviewer asks for changes, or QA finds a bug, the task goes back to In Progress. Only I move a task to Done, after I check the acceptance criteria.</w:t>
-      </w:r>
-    </w:p>
-    <w:p>
-      <w:pPr>
-        <w:pStyle w:val="BodyText"/>
-      </w:pPr>
-      <w:r>
-        <w:t xml:space="preserve">Our schedule ran from September 7 to October 16, in short sprints. Every day we had a fifteen-minute stand-up, and at the end of each sprint I compared the planned cost with the real cost. If a sprint used more hours than planned, we moved smaller tasks to the next phase, so the budget stayed under control.</w:t>
-      </w:r>
-    </w:p>
-    <w:bookmarkEnd w:id="24"/>
-    <w:bookmarkStart w:id="25" w:name="Xb03be9eec7d4e19a474c9d1d9bf25e7324cb421"/>
-    <w:p>
-      <w:pPr>
-        <w:pStyle w:val="Heading2"/>
-      </w:pPr>
-      <w:r>
-        <w:t xml:space="preserve">6. Traditional vs AI-driven financial management (4:10)</w:t>
-      </w:r>
-    </w:p>
-    <w:p>
-      <w:pPr>
-        <w:pStyle w:val="FirstParagraph"/>
-      </w:pPr>
-      <w:r>
-        <w:t xml:space="preserve">Now the main question of my research: what changes when AI agents help with project finances?</w:t>
-      </w:r>
-    </w:p>
-    <w:p>
-      <w:pPr>
-        <w:pStyle w:val="BodyText"/>
       </w:pPr>
       <w:r>
         <w:t xml:space="preserve">In the</w:t>
@@ -246,7 +164,7 @@
         <w:t xml:space="preserve"> </w:t>
       </w:r>
       <w:r>
-        <w:t xml:space="preserve">way, the manager makes the budget in Excel. They estimate costs from experience, and they check the real costs once a month. So problems with money are often found too late, when the budget is already spent.</w:t>
+        <w:t xml:space="preserve">way, the manager makes the budget in Excel and checks the costs once a month. So problems are found late.</w:t>
       </w:r>
     </w:p>
     <w:p>
@@ -270,25 +188,35 @@
         <w:t xml:space="preserve"> </w:t>
       </w:r>
       <w:r>
-        <w:t xml:space="preserve">way, intelligent agents watch the costs all the time. They can predict the final cost from the data of past sprints. They can warn the manager early when the budget is at risk. And they can choose a cheaper AI model or the free engine automatically.</w:t>
-      </w:r>
-    </w:p>
-    <w:p>
-      <w:pPr>
-        <w:pStyle w:val="BodyText"/>
-      </w:pPr>
-      <w:r>
-        <w:t xml:space="preserve">We saw this in our own project. Our system records its usage every day and keeps invoices in its database. This is the base for real-time cost control. Our developers also used AI assistants for coding, and this saved many working hours, which is the biggest cost.</w:t>
+        <w:t xml:space="preserve">way, agents watch the costs all the time. They predict the final cost from past sprints, warn early about risks, and choose cheaper options automatically. In our project, the system records its usage every day, and AI coding assistants saved many working hours, which is the biggest cost.</w:t>
+      </w:r>
+    </w:p>
+    <w:bookmarkEnd w:id="24"/>
+    <w:bookmarkStart w:id="25" w:name="current-status-415"/>
+    <w:p>
+      <w:pPr>
+        <w:pStyle w:val="Heading2"/>
+      </w:pPr>
+      <w:r>
+        <w:t xml:space="preserve">6. Current status (4:15)</w:t>
+      </w:r>
+    </w:p>
+    <w:p>
+      <w:pPr>
+        <w:pStyle w:val="FirstParagraph"/>
+      </w:pPr>
+      <w:r>
+        <w:t xml:space="preserve">By October 16, our MVP is ready. The platform, search in three languages, Uzbek speech, the phone connection, the operator console, billing and the developer API all work. Support for scanned documents and online payments is planned for the next phase.</w:t>
       </w:r>
     </w:p>
     <w:bookmarkEnd w:id="25"/>
-    <w:bookmarkStart w:id="26" w:name="current-status-and-progress-520"/>
+    <w:bookmarkStart w:id="26" w:name="plan-for-the-remaining-internship-445"/>
     <w:p>
       <w:pPr>
         <w:pStyle w:val="Heading2"/>
       </w:pPr>
       <w:r>
-        <w:t xml:space="preserve">7. Current status and progress (5:20)</w:t>
+        <w:t xml:space="preserve">7. Plan for the remaining internship (4:45)</w:t>
       </w:r>
     </w:p>
     <w:p>
@@ -296,33 +224,17 @@
         <w:pStyle w:val="FirstParagraph"/>
       </w:pPr>
       <w:r>
-        <w:t xml:space="preserve">Now, where are we today? By October 16, our MVP is ready. The main system works from start to end.</w:t>
-      </w:r>
-    </w:p>
-    <w:p>
-      <w:pPr>
-        <w:pStyle w:val="BodyText"/>
-      </w:pPr>
-      <w:r>
-        <w:t xml:space="preserve">We have finished the platform, knowledge search in three languages, Uzbek speech, the phone connection, the operator console, billing in Uzbek som and the developer API.</w:t>
-      </w:r>
-    </w:p>
-    <w:p>
-      <w:pPr>
-        <w:pStyle w:val="BodyText"/>
-      </w:pPr>
-      <w:r>
-        <w:t xml:space="preserve">A few improvements, like support for scanned documents and online payments, are planned for the next phase.</w:t>
+        <w:t xml:space="preserve">The internship ends on October 23. On October 17 and 18, I will write the final report with the full financial analysis. From October 19 to 21, we will test more call scenarios and fix small bugs. On October 22 and 23, I will prepare the final presentation and submit all documents.</w:t>
       </w:r>
     </w:p>
     <w:bookmarkEnd w:id="26"/>
-    <w:bookmarkStart w:id="27" w:name="plan-for-the-remaining-internship-555"/>
+    <w:bookmarkStart w:id="27" w:name="closing-520"/>
     <w:p>
       <w:pPr>
         <w:pStyle w:val="Heading2"/>
       </w:pPr>
       <w:r>
-        <w:t xml:space="preserve">8. Plan for the remaining internship (5:55)</w:t>
+        <w:t xml:space="preserve">8. Closing (5:20)</w:t>
       </w:r>
     </w:p>
     <w:p>
@@ -330,99 +242,7 @@
         <w:pStyle w:val="FirstParagraph"/>
       </w:pPr>
       <w:r>
-        <w:t xml:space="preserve">The internship ends on October 23. The product part is done, so the remaining days are for documents, testing and the final presentation.</w:t>
-      </w:r>
-    </w:p>
-    <w:p>
-      <w:pPr>
-        <w:numPr>
-          <w:ilvl w:val="0"/>
-          <w:numId w:val="1001"/>
-        </w:numPr>
-        <w:pStyle w:val="Compact"/>
-      </w:pPr>
-      <w:r>
-        <w:rPr>
-          <w:bCs/>
-          <w:b/>
-        </w:rPr>
-        <w:t xml:space="preserve">October 17 to 18:</w:t>
-      </w:r>
-      <w:r>
-        <w:t xml:space="preserve"> </w:t>
-      </w:r>
-      <w:r>
-        <w:t xml:space="preserve">write the final report with the full financial analysis of the project, and the technical documentation.</w:t>
-      </w:r>
-    </w:p>
-    <w:p>
-      <w:pPr>
-        <w:numPr>
-          <w:ilvl w:val="0"/>
-          <w:numId w:val="1001"/>
-        </w:numPr>
-        <w:pStyle w:val="Compact"/>
-      </w:pPr>
-      <w:r>
-        <w:rPr>
-          <w:bCs/>
-          <w:b/>
-        </w:rPr>
-        <w:t xml:space="preserve">October 19 to 21:</w:t>
-      </w:r>
-      <w:r>
-        <w:t xml:space="preserve"> </w:t>
-      </w:r>
-      <w:r>
-        <w:t xml:space="preserve">test more real call scenarios, fix small bugs, and add real content for more industries.</w:t>
-      </w:r>
-    </w:p>
-    <w:p>
-      <w:pPr>
-        <w:numPr>
-          <w:ilvl w:val="0"/>
-          <w:numId w:val="1001"/>
-        </w:numPr>
-        <w:pStyle w:val="Compact"/>
-      </w:pPr>
-      <w:r>
-        <w:rPr>
-          <w:bCs/>
-          <w:b/>
-        </w:rPr>
-        <w:t xml:space="preserve">October 22 to 23:</w:t>
-      </w:r>
-      <w:r>
-        <w:t xml:space="preserve"> </w:t>
-      </w:r>
-      <w:r>
-        <w:t xml:space="preserve">prepare the final presentation and demo, and submit all documents.</w:t>
-      </w:r>
-    </w:p>
-    <w:bookmarkEnd w:id="27"/>
-    <w:bookmarkStart w:id="28" w:name="closing-630"/>
-    <w:p>
-      <w:pPr>
-        <w:pStyle w:val="Heading2"/>
-      </w:pPr>
-      <w:r>
-        <w:t xml:space="preserve">9. Closing (6:30)</w:t>
-      </w:r>
-    </w:p>
-    <w:p>
-      <w:pPr>
-        <w:pStyle w:val="FirstParagraph"/>
-      </w:pPr>
-      <w:r>
-        <w:t xml:space="preserve">So what did I learn as a project manager? AI agents are strong helpers in financial management. They track costs all the time, predict problems early and help to choose cheaper options. But AI does not replace the manager. The budget, the priorities and the final decisions still belong to people. Our product follows the same idea: when the AI is not sure, a human takes over.</w:t>
-      </w:r>
-    </w:p>
-    <w:p>
-      <w:pPr>
-        <w:pStyle w:val="BodyText"/>
-      </w:pPr>
-      <w:r>
-        <w:t xml:space="preserve">Thank you for listening.</w:t>
+        <w:t xml:space="preserve">To sum up: AI agents make financial management faster and more accurate. But the budget and the final decisions still belong to people. Thank you for listening.</w:t>
       </w:r>
     </w:p>
     <w:p>
@@ -447,7 +267,7 @@
         <w:t xml:space="preserve"> </w:t>
       </w:r>
       <w:r>
-        <w:t xml:space="preserve">speak slowly and pause between parts. If you are short on time, make part 5 shorter first. Say</w:t>
+        <w:t xml:space="preserve">speak calmly and pause between parts. Say</w:t>
       </w:r>
       <w:r>
         <w:t xml:space="preserve"> </w:t>
@@ -465,11 +285,11 @@
         <w:t xml:space="preserve"> </w:t>
       </w:r>
       <w:r>
-        <w:t xml:space="preserve">before the numbers: they are estimates. Practise once with a timer.</w:t>
-      </w:r>
-    </w:p>
+        <w:t xml:space="preserve">before the numbers: they are estimates.</w:t>
+      </w:r>
+    </w:p>
+    <w:bookmarkEnd w:id="27"/>
     <w:bookmarkEnd w:id="28"/>
-    <w:bookmarkEnd w:id="29"/>
     <w:sectPr/>
   </w:body>
 </w:document>
@@ -576,87 +396,8 @@
       </w:pPr>
     </w:lvl>
   </w:abstractNum>
-  <w:abstractNum w:abstractNumId="991">
-    <w:nsid w:val="A991"/>
-    <w:multiLevelType w:val="multilevel"/>
-    <w:lvl w:ilvl="0">
-      <w:numFmt w:val="bullet"/>
-      <w:lvlText w:val="•"/>
-      <w:lvlJc w:val="left"/>
-      <w:pPr>
-        <w:ind w:left="720" w:hanging="480"/>
-      </w:pPr>
-    </w:lvl>
-    <w:lvl w:ilvl="1">
-      <w:numFmt w:val="bullet"/>
-      <w:lvlText w:val="–"/>
-      <w:lvlJc w:val="left"/>
-      <w:pPr>
-        <w:ind w:left="1440" w:hanging="480"/>
-      </w:pPr>
-    </w:lvl>
-    <w:lvl w:ilvl="2">
-      <w:numFmt w:val="bullet"/>
-      <w:lvlText w:val="•"/>
-      <w:lvlJc w:val="left"/>
-      <w:pPr>
-        <w:ind w:left="2160" w:hanging="480"/>
-      </w:pPr>
-    </w:lvl>
-    <w:lvl w:ilvl="3">
-      <w:numFmt w:val="bullet"/>
-      <w:lvlText w:val="–"/>
-      <w:lvlJc w:val="left"/>
-      <w:pPr>
-        <w:ind w:left="2880" w:hanging="480"/>
-      </w:pPr>
-    </w:lvl>
-    <w:lvl w:ilvl="4">
-      <w:numFmt w:val="bullet"/>
-      <w:lvlText w:val="•"/>
-      <w:lvlJc w:val="left"/>
-      <w:pPr>
-        <w:ind w:left="3600" w:hanging="480"/>
-      </w:pPr>
-    </w:lvl>
-    <w:lvl w:ilvl="5">
-      <w:numFmt w:val="bullet"/>
-      <w:lvlText w:val="–"/>
-      <w:lvlJc w:val="left"/>
-      <w:pPr>
-        <w:ind w:left="4320" w:hanging="480"/>
-      </w:pPr>
-    </w:lvl>
-    <w:lvl w:ilvl="6">
-      <w:numFmt w:val="bullet"/>
-      <w:lvlText w:val="•"/>
-      <w:lvlJc w:val="left"/>
-      <w:pPr>
-        <w:ind w:left="5040" w:hanging="480"/>
-      </w:pPr>
-    </w:lvl>
-    <w:lvl w:ilvl="7">
-      <w:numFmt w:val="bullet"/>
-      <w:lvlText w:val="–"/>
-      <w:lvlJc w:val="left"/>
-      <w:pPr>
-        <w:ind w:left="5760" w:hanging="480"/>
-      </w:pPr>
-    </w:lvl>
-    <w:lvl w:ilvl="8">
-      <w:numFmt w:val="bullet"/>
-      <w:lvlText w:val="•"/>
-      <w:lvlJc w:val="left"/>
-      <w:pPr>
-        <w:ind w:left="6480" w:hanging="480"/>
-      </w:pPr>
-    </w:lvl>
-  </w:abstractNum>
   <w:num w:numId="1000">
     <w:abstractNumId w:val="990"/>
-  </w:num>
-  <w:num w:numId="1001">
-    <w:abstractNumId w:val="991"/>
   </w:num>
 </w:numbering>
 </file>

</xml_diff>